<commit_message>
Basic: reshoot Simplified Chinese screenshots and localise the sample files
The Simplified Chinese edition was reusing the Traditional Chinese
screenshots and sample files. Both are now its own.

- 19 screenshots recaptured against a Simplified Chinese Copilot UI,
  with Simplified Chinese responses (screenshots_cn, 1500x950)
- Screenshot filenames switched to Simplified Chinese
- Sample files rewritten for a mainland context: figures in RMB,
  regional wording, and a Simplified Chinese caption on the image
- Sidebar history cleaned of customer and project names before shooting

Co-authored-by: Copilot <223556219+Copilot@users.noreply.github.com>
</commit_message>
<xml_diff>
--- a/Basic/zh-cn/samples/q1_2025_business_review.docx
+++ b/Basic/zh-cn/samples/q1_2025_business_review.docx
@@ -7,7 +7,7 @@
         <w:pStyle w:val="Title"/>
       </w:pPr>
       <w:r>
-        <w:t>2025 年第一季 業務回顧報告</w:t>
+        <w:t>2025 年第一季度业务回顾报告</w:t>
       </w:r>
     </w:p>
     <w:p>
@@ -15,12 +15,12 @@
         <w:pStyle w:val="Heading1"/>
       </w:pPr>
       <w:r>
-        <w:t>一、整體業績摘要</w:t>
+        <w:t>一、整体业绩概览</w:t>
       </w:r>
     </w:p>
     <w:p>
       <w:r>
-        <w:t>2025 年第一季公司整體營收達新台幣 8.5 億元，較去年同期成長 18%，其中亞太區成長 25%，為歷年最佳表現。毛利率維持在 42%，淨利率提升至 15%。主要動能來自雲端訂閱服務 (+40%) 與 AI 解決方案導入 (+62%)。</w:t>
+        <w:t>一季度公司整体营收 19.6 亿元人民币，同比增长 18%，其中华东区增长 25%，创下历史最好成绩。毛利率稳定在 42%，净利率提升到 15%。增长主要由两块业务带动：云订阅服务同比 +40%，AI 解决方案落地同比 +62%。</w:t>
       </w:r>
     </w:p>
     <w:p>
@@ -28,27 +28,27 @@
         <w:pStyle w:val="Heading1"/>
       </w:pPr>
       <w:r>
-        <w:t>二、產品線表現</w:t>
+        <w:t>二、各产品线表现</w:t>
       </w:r>
     </w:p>
     <w:p>
       <w:r>
-        <w:t>• 雲端服務：營收 3.2 億，YoY +40%</w:t>
+        <w:t>• 云服务：营收 7.4 亿元，同比 +40%</w:t>
       </w:r>
     </w:p>
     <w:p>
       <w:r>
-        <w:t>• AI 解決方案：營收 1.8 億，YoY +62%</w:t>
+        <w:t>• AI 解决方案：营收 4.2 亿元，同比 +62%</w:t>
       </w:r>
     </w:p>
     <w:p>
       <w:r>
-        <w:t>• 傳統授權軟體：營收 2.1 億，YoY -8%</w:t>
+        <w:t>• 传统授权软件：营收 4.8 亿元，同比 -8%</w:t>
       </w:r>
     </w:p>
     <w:p>
       <w:r>
-        <w:t>• 專業服務：營收 1.4 億，YoY +12%</w:t>
+        <w:t>• 专业服务：营收 3.2 亿元，同比 +12%</w:t>
       </w:r>
     </w:p>
     <w:p>
@@ -56,12 +56,12 @@
         <w:pStyle w:val="Heading1"/>
       </w:pPr>
       <w:r>
-        <w:t>三、市場與客戶</w:t>
+        <w:t>三、市场与客户</w:t>
       </w:r>
     </w:p>
     <w:p>
       <w:r>
-        <w:t>本季新增企業客戶 87 家，其中 23 家為大型企業 (Fortune 500)。製造業與金融業仍為主力市場，合計貢獻 58% 營收。零售業需求快速攀升，與去年同期相比成長 35%。</w:t>
+        <w:t>本季度新签企业客户 87 家，其中 23 家为大型集团客户。制造业和金融业依然是主力市场，两者合计贡献 58% 的营收。零售行业需求增长很快，同比增长 35%，值得重点跟进。</w:t>
       </w:r>
     </w:p>
     <w:p>
@@ -69,22 +69,22 @@
         <w:pStyle w:val="Heading1"/>
       </w:pPr>
       <w:r>
-        <w:t>四、挑戰與風險</w:t>
+        <w:t>四、风险与挑战</w:t>
       </w:r>
     </w:p>
     <w:p>
       <w:r>
-        <w:t>1. 美元匯率波動影響外銷毛利約 1.5 個百分點。</w:t>
+        <w:t>1. 汇率波动对出口业务毛利的影响约为 1.5 个百分点。</w:t>
       </w:r>
     </w:p>
     <w:p>
       <w:r>
-        <w:t>2. 雲端基礎建設成本上升 12%，需檢討定價策略。</w:t>
+        <w:t>2. 云基础设施成本上涨 12%，定价策略需要重新测算。</w:t>
       </w:r>
     </w:p>
     <w:p>
       <w:r>
-        <w:t>3. 高階 AI 人才招募競爭激烈，第一季空缺率達 18%。</w:t>
+        <w:t>3. 高端 AI 人才争夺激烈，一季度岗位空缺率达到 18%。</w:t>
       </w:r>
     </w:p>
     <w:p>
@@ -92,18 +92,18 @@
         <w:pStyle w:val="Heading1"/>
       </w:pPr>
       <w:r>
-        <w:t>五、下一季重點</w:t>
+        <w:t>五、下季度工作重点</w:t>
       </w:r>
     </w:p>
     <w:p>
       <w:r>
-        <w:t>聚焦三大戰略：（1）擴大 AI 產品線、發表新一代多模態解決方案；（2）深化亞太市場通路布局，新增 5 個城市辦公室；（3）完成 SOC2 與 ISO 27001 雙認證強化客戶信任。</w:t>
+        <w:t>下个季度重点抓三件事：一是扩充 AI 产品线，发布新一代多模态解决方案；二是加密区域渠道布局，新设 5 个城市办事处；三是完成 SOC2 与 ISO 27001 双认证，把客户的信任基础打牢。</w:t>
       </w:r>
     </w:p>
     <w:p/>
     <w:p>
       <w:r>
-        <w:t>— 報告結束 —</w:t>
+        <w:t>— 报告完 —</w:t>
       </w:r>
     </w:p>
     <w:sectPr>

</xml_diff>